<commit_message>
docs(paper): refresh per-lane numbers and pipeline throughput
The original numbers in the Results section were measured against the
old sliding-window run on the sample-traffic clip (226 raw detections).
The hybrid YOLOv8-nano + MobileViT + SORT pipeline now produces:

- 8 979 raw detections, 599 unique vehicles (411 cars, 115 buses, 73 trucks).
- Left lane (left half of the frame): 4 927 detections, 74% car / 21% bus.
- Right lane: 3 502 detections, 87% car / 5% bus / 8% truck.
- End-to-end throughput ~10 fps on the 1 800-frame clip (2 min 56 s total
  with frame_skip=3), versus ~3 fps for the sliding-window baseline.

Both paper.md and the docx generator are updated, and the docx + PDF
are rebuilt. The paper remains four pages of A4 two-column.
</commit_message>
<xml_diff>
--- a/docs/paper/EPL445_Final_Paper.docx
+++ b/docs/paper/EPL445_Final_Paper.docx
@@ -2165,7 +2165,7 @@
           <w:sz w:val="20"/>
           <w:szCs w:val="20"/>
         </w:rPr>
-        <w:t xml:space="preserve">Figure 5 shows the per-frame vehicle count over the 1 800-frame sample-traffic video. Density peaks correspond to platoon arrivals at the intersection in frame. The dashboard exposes the same series in real time, plus a per-lane breakdown derived from operator-drawn polygons. On the sample-traffic video, with two equal-width lanes split down the centre of the frame, the polygon counter reports 76 detections in the left lane (around 87% bus) and 54 in the right lane (mixed truck, car, bus), demonstrating that the same model can support per-direction counting without retraining.</w:t>
+        <w:t xml:space="preserve">Figure 5 shows the per-frame vehicle count over the 1 800-frame sample-traffic video. The hybrid pipeline emits 8 979 raw detections, which the SORT tracker resolves into 599 unique vehicles (411 cars, 115 buses, 73 trucks). The dashboard exposes the per-frame series in real time, plus a per-lane breakdown derived from operator-drawn polygons. On the sample-traffic video, with two equal-width lanes split down the centre of the frame, the polygon counter reports 4 927 detections in the left lane (74% car, 21% bus) and 3 502 in the right lane (87% car, 5% bus, 8% truck), demonstrating that the same model can support per-direction counting without retraining.</w:t>
       </w:r>
     </w:p>
     <w:p>
@@ -2259,7 +2259,7 @@
           <w:sz w:val="20"/>
           <w:szCs w:val="20"/>
         </w:rPr>
-        <w:t xml:space="preserve">Table III reports classifier-only inference latency at three input resolutions, measured on the AMD Radeon 780M iGPU. The 256 by 256 setting is the production resolution; the lower resolutions trade about one to two percentage points of accuracy for roughly two-times faster inference. End-to-end pipeline throughput (YOLO + MobileViT + SORT + annotation) is approximately 4 frames per second on 4K frames downscaled to 640 by 360 for inference, versus 3 frames per second for the sliding-window baseline.</w:t>
+        <w:t xml:space="preserve">Table III reports classifier-only inference latency at three input resolutions, measured on the AMD Radeon 780M iGPU. The 256 by 256 setting is the production resolution; the lower resolutions trade about one to two percentage points of accuracy for roughly two-times faster inference. End-to-end pipeline throughput (YOLO + MobileViT + SORT + annotation) reaches approximately 10 frames per second on the 1 800-frame sample-traffic clip downscaled to 640 by 360 for inference (the full clip processes in 2 min 56 s with frame_skip=3), versus 3 frames per second for the sliding-window baseline.</w:t>
       </w:r>
     </w:p>
     <w:p>

</xml_diff>